<commit_message>
Initial commit for student performance pipeline
</commit_message>
<xml_diff>
--- a/Capstone_Report.docx
+++ b/Capstone_Report.docx
@@ -57,14 +57,30 @@
           <w:p>
             <w:pPr>
               <w:jc w:val="left"/>
+              <w:rPr>
+                <w:color w:val="558ED5" w:themeColor="text2" w:themeTint="99"/>
+                <w14:textFill>
+                  <w14:solidFill>
+                    <w14:schemeClr w14:val="tx2">
+                      <w14:lumMod w14:val="60000"/>
+                      <w14:lumOff w14:val="40000"/>
+                    </w14:schemeClr>
+                  </w14:solidFill>
+                </w14:textFill>
+              </w:rPr>
             </w:pPr>
             <w:r>
               <w:rPr>
                 <w:b/>
                 <w:bCs/>
-                <w:color w:val="FFFFFF"/>
-                <w:sz w:val="20"/>
-                <w:szCs w:val="20"/>
+                <w:color w:val="FFFFFF" w:themeColor="background1"/>
+                <w:sz w:val="20"/>
+                <w:szCs w:val="20"/>
+                <w14:textFill>
+                  <w14:solidFill>
+                    <w14:schemeClr w14:val="bg1"/>
+                  </w14:solidFill>
+                </w14:textFill>
               </w:rPr>
               <w:t>DATABRICKS AND SNOWFLAKE  |  CAPSTONE PROJECT 2026</w:t>
             </w:r>
@@ -153,24 +169,42 @@
         <w:tc>
           <w:tcPr>
             <w:tcW w:w="2800" w:type="dxa"/>
-            <w:shd w:val="clear" w:color="auto" w:fill="F1E9D8"/>
-            <w:tcMar>
-              <w:top w:w="80" w:type="dxa"/>
-              <w:left w:w="100" w:type="dxa"/>
-              <w:bottom w:w="80" w:type="dxa"/>
-              <w:right w:w="100" w:type="dxa"/>
-            </w:tcMar>
-          </w:tcPr>
-          <w:p>
-            <w:pPr>
-              <w:jc w:val="left"/>
+            <w:shd w:val="clear" w:color="auto" w:fill="8DB3E2" w:themeFill="text2" w:themeFillTint="66"/>
+            <w:tcMar>
+              <w:top w:w="80" w:type="dxa"/>
+              <w:left w:w="100" w:type="dxa"/>
+              <w:bottom w:w="80" w:type="dxa"/>
+              <w:right w:w="100" w:type="dxa"/>
+            </w:tcMar>
+          </w:tcPr>
+          <w:p>
+            <w:pPr>
+              <w:jc w:val="left"/>
+              <w:rPr>
+                <w:color w:val="000000" w:themeColor="text1"/>
+                <w:highlight w:val="none"/>
+                <w:shd w:val="clear" w:color="auto" w:fill="auto"/>
+                <w14:textFill>
+                  <w14:solidFill>
+                    <w14:schemeClr w14:val="tx1"/>
+                  </w14:solidFill>
+                </w14:textFill>
+              </w:rPr>
             </w:pPr>
             <w:r>
               <w:rPr>
                 <w:b/>
                 <w:bCs/>
-                <w:sz w:val="20"/>
-                <w:szCs w:val="20"/>
+                <w:color w:val="000000" w:themeColor="text1"/>
+                <w:sz w:val="20"/>
+                <w:szCs w:val="20"/>
+                <w:highlight w:val="none"/>
+                <w:shd w:val="clear" w:color="auto" w:fill="auto"/>
+                <w14:textFill>
+                  <w14:solidFill>
+                    <w14:schemeClr w14:val="tx1"/>
+                  </w14:solidFill>
+                </w14:textFill>
               </w:rPr>
               <w:t>NAME</w:t>
             </w:r>
@@ -203,7 +237,7 @@
                 <w:szCs w:val="20"/>
                 <w:lang w:val="en-US"/>
               </w:rPr>
-              <w:t>Preetam Mondal</w:t>
+              <w:t>Srijoswin Mazumder</w:t>
             </w:r>
           </w:p>
         </w:tc>
@@ -228,24 +262,42 @@
         <w:tc>
           <w:tcPr>
             <w:tcW w:w="2800" w:type="dxa"/>
-            <w:shd w:val="clear" w:color="auto" w:fill="F1E9D8"/>
-            <w:tcMar>
-              <w:top w:w="80" w:type="dxa"/>
-              <w:left w:w="100" w:type="dxa"/>
-              <w:bottom w:w="80" w:type="dxa"/>
-              <w:right w:w="100" w:type="dxa"/>
-            </w:tcMar>
-          </w:tcPr>
-          <w:p>
-            <w:pPr>
-              <w:jc w:val="left"/>
+            <w:shd w:val="clear" w:color="auto" w:fill="8DB3E2" w:themeFill="text2" w:themeFillTint="66"/>
+            <w:tcMar>
+              <w:top w:w="80" w:type="dxa"/>
+              <w:left w:w="100" w:type="dxa"/>
+              <w:bottom w:w="80" w:type="dxa"/>
+              <w:right w:w="100" w:type="dxa"/>
+            </w:tcMar>
+          </w:tcPr>
+          <w:p>
+            <w:pPr>
+              <w:jc w:val="left"/>
+              <w:rPr>
+                <w:color w:val="000000" w:themeColor="text1"/>
+                <w:highlight w:val="none"/>
+                <w:shd w:val="clear" w:color="auto" w:fill="auto"/>
+                <w14:textFill>
+                  <w14:solidFill>
+                    <w14:schemeClr w14:val="tx1"/>
+                  </w14:solidFill>
+                </w14:textFill>
+              </w:rPr>
             </w:pPr>
             <w:r>
               <w:rPr>
                 <w:b/>
                 <w:bCs/>
-                <w:sz w:val="20"/>
-                <w:szCs w:val="20"/>
+                <w:color w:val="000000" w:themeColor="text1"/>
+                <w:sz w:val="20"/>
+                <w:szCs w:val="20"/>
+                <w:highlight w:val="none"/>
+                <w:shd w:val="clear" w:color="auto" w:fill="auto"/>
+                <w14:textFill>
+                  <w14:solidFill>
+                    <w14:schemeClr w14:val="tx1"/>
+                  </w14:solidFill>
+                </w14:textFill>
               </w:rPr>
               <w:t>ROLL NUMBER</w:t>
             </w:r>
@@ -264,15 +316,30 @@
           <w:p>
             <w:pPr>
               <w:jc w:val="left"/>
-            </w:pPr>
-            <w:r>
-              <w:rPr>
-                <w:b w:val="0"/>
-                <w:bCs w:val="0"/>
-                <w:sz w:val="20"/>
-                <w:szCs w:val="20"/>
-              </w:rPr>
-              <w:t>23051768</w:t>
+              <w:rPr>
+                <w:rFonts w:hint="default"/>
+                <w:lang w:val="en-US"/>
+              </w:rPr>
+            </w:pPr>
+            <w:r>
+              <w:rPr>
+                <w:b w:val="0"/>
+                <w:bCs w:val="0"/>
+                <w:sz w:val="20"/>
+                <w:szCs w:val="20"/>
+              </w:rPr>
+              <w:t>23</w:t>
+            </w:r>
+            <w:r>
+              <w:rPr>
+                <w:rFonts w:hint="default"/>
+                <w:b w:val="0"/>
+                <w:bCs w:val="0"/>
+                <w:sz w:val="20"/>
+                <w:szCs w:val="20"/>
+                <w:lang w:val="en-US"/>
+              </w:rPr>
+              <w:t>053086</w:t>
             </w:r>
           </w:p>
         </w:tc>
@@ -297,24 +364,42 @@
         <w:tc>
           <w:tcPr>
             <w:tcW w:w="2800" w:type="dxa"/>
-            <w:shd w:val="clear" w:color="auto" w:fill="F1E9D8"/>
-            <w:tcMar>
-              <w:top w:w="80" w:type="dxa"/>
-              <w:left w:w="100" w:type="dxa"/>
-              <w:bottom w:w="80" w:type="dxa"/>
-              <w:right w:w="100" w:type="dxa"/>
-            </w:tcMar>
-          </w:tcPr>
-          <w:p>
-            <w:pPr>
-              <w:jc w:val="left"/>
+            <w:shd w:val="clear" w:color="auto" w:fill="8DB3E2" w:themeFill="text2" w:themeFillTint="66"/>
+            <w:tcMar>
+              <w:top w:w="80" w:type="dxa"/>
+              <w:left w:w="100" w:type="dxa"/>
+              <w:bottom w:w="80" w:type="dxa"/>
+              <w:right w:w="100" w:type="dxa"/>
+            </w:tcMar>
+          </w:tcPr>
+          <w:p>
+            <w:pPr>
+              <w:jc w:val="left"/>
+              <w:rPr>
+                <w:color w:val="000000" w:themeColor="text1"/>
+                <w:highlight w:val="none"/>
+                <w:shd w:val="clear" w:color="auto" w:fill="auto"/>
+                <w14:textFill>
+                  <w14:solidFill>
+                    <w14:schemeClr w14:val="tx1"/>
+                  </w14:solidFill>
+                </w14:textFill>
+              </w:rPr>
             </w:pPr>
             <w:r>
               <w:rPr>
                 <w:b/>
                 <w:bCs/>
-                <w:sz w:val="20"/>
-                <w:szCs w:val="20"/>
+                <w:color w:val="000000" w:themeColor="text1"/>
+                <w:sz w:val="20"/>
+                <w:szCs w:val="20"/>
+                <w:highlight w:val="none"/>
+                <w:shd w:val="clear" w:color="auto" w:fill="auto"/>
+                <w14:textFill>
+                  <w14:solidFill>
+                    <w14:schemeClr w14:val="tx1"/>
+                  </w14:solidFill>
+                </w14:textFill>
               </w:rPr>
               <w:t>BATCH</w:t>
             </w:r>
@@ -366,24 +451,42 @@
         <w:tc>
           <w:tcPr>
             <w:tcW w:w="2800" w:type="dxa"/>
-            <w:shd w:val="clear" w:color="auto" w:fill="F1E9D8"/>
-            <w:tcMar>
-              <w:top w:w="80" w:type="dxa"/>
-              <w:left w:w="100" w:type="dxa"/>
-              <w:bottom w:w="80" w:type="dxa"/>
-              <w:right w:w="100" w:type="dxa"/>
-            </w:tcMar>
-          </w:tcPr>
-          <w:p>
-            <w:pPr>
-              <w:jc w:val="left"/>
+            <w:shd w:val="clear" w:color="auto" w:fill="8DB3E2" w:themeFill="text2" w:themeFillTint="66"/>
+            <w:tcMar>
+              <w:top w:w="80" w:type="dxa"/>
+              <w:left w:w="100" w:type="dxa"/>
+              <w:bottom w:w="80" w:type="dxa"/>
+              <w:right w:w="100" w:type="dxa"/>
+            </w:tcMar>
+          </w:tcPr>
+          <w:p>
+            <w:pPr>
+              <w:jc w:val="left"/>
+              <w:rPr>
+                <w:color w:val="000000" w:themeColor="text1"/>
+                <w:highlight w:val="none"/>
+                <w:shd w:val="clear" w:color="auto" w:fill="auto"/>
+                <w14:textFill>
+                  <w14:solidFill>
+                    <w14:schemeClr w14:val="tx1"/>
+                  </w14:solidFill>
+                </w14:textFill>
+              </w:rPr>
             </w:pPr>
             <w:r>
               <w:rPr>
                 <w:b/>
                 <w:bCs/>
-                <w:sz w:val="20"/>
-                <w:szCs w:val="20"/>
+                <w:color w:val="000000" w:themeColor="text1"/>
+                <w:sz w:val="20"/>
+                <w:szCs w:val="20"/>
+                <w:highlight w:val="none"/>
+                <w:shd w:val="clear" w:color="auto" w:fill="auto"/>
+                <w14:textFill>
+                  <w14:solidFill>
+                    <w14:schemeClr w14:val="tx1"/>
+                  </w14:solidFill>
+                </w14:textFill>
               </w:rPr>
               <w:t>PROJECT TOPIC</w:t>
             </w:r>
@@ -435,24 +538,42 @@
         <w:tc>
           <w:tcPr>
             <w:tcW w:w="2800" w:type="dxa"/>
-            <w:shd w:val="clear" w:color="auto" w:fill="F1E9D8"/>
-            <w:tcMar>
-              <w:top w:w="80" w:type="dxa"/>
-              <w:left w:w="100" w:type="dxa"/>
-              <w:bottom w:w="80" w:type="dxa"/>
-              <w:right w:w="100" w:type="dxa"/>
-            </w:tcMar>
-          </w:tcPr>
-          <w:p>
-            <w:pPr>
-              <w:jc w:val="left"/>
+            <w:shd w:val="clear" w:color="auto" w:fill="8DB3E2" w:themeFill="text2" w:themeFillTint="66"/>
+            <w:tcMar>
+              <w:top w:w="80" w:type="dxa"/>
+              <w:left w:w="100" w:type="dxa"/>
+              <w:bottom w:w="80" w:type="dxa"/>
+              <w:right w:w="100" w:type="dxa"/>
+            </w:tcMar>
+          </w:tcPr>
+          <w:p>
+            <w:pPr>
+              <w:jc w:val="left"/>
+              <w:rPr>
+                <w:color w:val="000000" w:themeColor="text1"/>
+                <w:highlight w:val="none"/>
+                <w:shd w:val="clear" w:color="auto" w:fill="auto"/>
+                <w14:textFill>
+                  <w14:solidFill>
+                    <w14:schemeClr w14:val="tx1"/>
+                  </w14:solidFill>
+                </w14:textFill>
+              </w:rPr>
             </w:pPr>
             <w:r>
               <w:rPr>
                 <w:b/>
                 <w:bCs/>
-                <w:sz w:val="20"/>
-                <w:szCs w:val="20"/>
+                <w:color w:val="000000" w:themeColor="text1"/>
+                <w:sz w:val="20"/>
+                <w:szCs w:val="20"/>
+                <w:highlight w:val="none"/>
+                <w:shd w:val="clear" w:color="auto" w:fill="auto"/>
+                <w14:textFill>
+                  <w14:solidFill>
+                    <w14:schemeClr w14:val="tx1"/>
+                  </w14:solidFill>
+                </w14:textFill>
               </w:rPr>
               <w:t>SUBMITTED TO</w:t>
             </w:r>
@@ -515,24 +636,42 @@
         <w:tc>
           <w:tcPr>
             <w:tcW w:w="2800" w:type="dxa"/>
-            <w:shd w:val="clear" w:color="auto" w:fill="F1E9D8"/>
-            <w:tcMar>
-              <w:top w:w="80" w:type="dxa"/>
-              <w:left w:w="100" w:type="dxa"/>
-              <w:bottom w:w="80" w:type="dxa"/>
-              <w:right w:w="100" w:type="dxa"/>
-            </w:tcMar>
-          </w:tcPr>
-          <w:p>
-            <w:pPr>
-              <w:jc w:val="left"/>
+            <w:shd w:val="clear" w:color="auto" w:fill="8DB3E2" w:themeFill="text2" w:themeFillTint="66"/>
+            <w:tcMar>
+              <w:top w:w="80" w:type="dxa"/>
+              <w:left w:w="100" w:type="dxa"/>
+              <w:bottom w:w="80" w:type="dxa"/>
+              <w:right w:w="100" w:type="dxa"/>
+            </w:tcMar>
+          </w:tcPr>
+          <w:p>
+            <w:pPr>
+              <w:jc w:val="left"/>
+              <w:rPr>
+                <w:color w:val="000000" w:themeColor="text1"/>
+                <w:highlight w:val="none"/>
+                <w:shd w:val="clear" w:color="auto" w:fill="auto"/>
+                <w14:textFill>
+                  <w14:solidFill>
+                    <w14:schemeClr w14:val="tx1"/>
+                  </w14:solidFill>
+                </w14:textFill>
+              </w:rPr>
             </w:pPr>
             <w:r>
               <w:rPr>
                 <w:b/>
                 <w:bCs/>
-                <w:sz w:val="20"/>
-                <w:szCs w:val="20"/>
+                <w:color w:val="000000" w:themeColor="text1"/>
+                <w:sz w:val="20"/>
+                <w:szCs w:val="20"/>
+                <w:highlight w:val="none"/>
+                <w:shd w:val="clear" w:color="auto" w:fill="auto"/>
+                <w14:textFill>
+                  <w14:solidFill>
+                    <w14:schemeClr w14:val="tx1"/>
+                  </w14:solidFill>
+                </w14:textFill>
               </w:rPr>
               <w:t>DATE</w:t>
             </w:r>
@@ -567,8 +706,6 @@
               </w:rPr>
               <w:t>27 November 2026</w:t>
             </w:r>
-            <w:bookmarkStart w:id="0" w:name="_GoBack"/>
-            <w:bookmarkEnd w:id="0"/>
           </w:p>
         </w:tc>
       </w:tr>
@@ -577,6 +714,8 @@
       <w:r>
         <w:br w:type="page"/>
       </w:r>
+      <w:bookmarkStart w:id="0" w:name="_GoBack"/>
+      <w:bookmarkEnd w:id="0"/>
     </w:p>
     <w:p>
       <w:pPr>
@@ -8664,6 +8803,14 @@
       </w:tblGrid>
       <w:tr>
         <w:tblPrEx>
+          <w:tblBorders>
+            <w:top w:val="single" w:color="auto" w:sz="4" w:space="0"/>
+            <w:left w:val="single" w:color="auto" w:sz="4" w:space="0"/>
+            <w:bottom w:val="single" w:color="auto" w:sz="4" w:space="0"/>
+            <w:right w:val="single" w:color="auto" w:sz="4" w:space="0"/>
+            <w:insideH w:val="single" w:color="auto" w:sz="4" w:space="0"/>
+            <w:insideV w:val="single" w:color="auto" w:sz="4" w:space="0"/>
+          </w:tblBorders>
           <w:tblCellMar>
             <w:top w:w="0" w:type="dxa"/>
             <w:left w:w="10" w:type="dxa"/>
@@ -9180,7 +9327,7 @@
   <w:docDefaults>
     <w:rPrDefault>
       <w:rPr>
-        <w:rFonts w:ascii="Calibri" w:hAnsi="Calibri" w:eastAsia="Calibri" w:cs="Calibri"/>
+        <w:rFonts w:ascii="Times New Roman" w:hAnsi="Times New Roman" w:eastAsia="SimSun" w:cs="Times New Roman"/>
       </w:rPr>
     </w:rPrDefault>
     <w:pPrDefault/>
@@ -9229,7 +9376,7 @@
     <w:lsdException w:unhideWhenUsed="0" w:uiPriority="0" w:semiHidden="0" w:name="line number"/>
     <w:lsdException w:unhideWhenUsed="0" w:uiPriority="0" w:semiHidden="0" w:name="page number"/>
     <w:lsdException w:uiPriority="99" w:name="endnote reference"/>
-    <w:lsdException w:uiPriority="99" w:name="endnote text"/>
+    <w:lsdException w:qFormat="1" w:uiPriority="99" w:name="endnote text"/>
     <w:lsdException w:unhideWhenUsed="0" w:uiPriority="0" w:semiHidden="0" w:name="table of authorities"/>
     <w:lsdException w:unhideWhenUsed="0" w:uiPriority="0" w:semiHidden="0" w:name="macro"/>
     <w:lsdException w:unhideWhenUsed="0" w:uiPriority="0" w:semiHidden="0" w:name="toa heading"/>
@@ -9271,7 +9418,7 @@
     <w:lsdException w:unhideWhenUsed="0" w:uiPriority="0" w:semiHidden="0" w:name="Body Text Indent 2"/>
     <w:lsdException w:unhideWhenUsed="0" w:uiPriority="0" w:semiHidden="0" w:name="Body Text Indent 3"/>
     <w:lsdException w:unhideWhenUsed="0" w:uiPriority="0" w:semiHidden="0" w:name="Block Text"/>
-    <w:lsdException w:uiPriority="99" w:semiHidden="0" w:name="Hyperlink"/>
+    <w:lsdException w:qFormat="1" w:uiPriority="99" w:semiHidden="0" w:name="Hyperlink"/>
     <w:lsdException w:unhideWhenUsed="0" w:uiPriority="0" w:semiHidden="0" w:name="FollowedHyperlink"/>
     <w:lsdException w:qFormat="1" w:unhideWhenUsed="0" w:uiPriority="0" w:semiHidden="0" w:name="Strong"/>
     <w:lsdException w:qFormat="1" w:unhideWhenUsed="0" w:uiPriority="0" w:semiHidden="0" w:name="Emphasis"/>
@@ -9564,6 +9711,7 @@
     <w:link w:val="18"/>
     <w:semiHidden/>
     <w:unhideWhenUsed/>
+    <w:qFormat/>
     <w:uiPriority w:val="99"/>
     <w:pPr>
       <w:spacing w:after="0" w:line="240" w:lineRule="auto"/>
@@ -9601,6 +9749,7 @@
   <w:style w:type="character" w:styleId="14">
     <w:name w:val="Hyperlink"/>
     <w:unhideWhenUsed/>
+    <w:qFormat/>
     <w:uiPriority w:val="99"/>
     <w:rPr>
       <w:color w:val="0563C1"/>
@@ -9643,6 +9792,7 @@
     <w:link w:val="11"/>
     <w:semiHidden/>
     <w:unhideWhenUsed/>
+    <w:qFormat/>
     <w:uiPriority w:val="99"/>
     <w:rPr>
       <w:sz w:val="20"/>

</xml_diff>